<commit_message>
feat(solicitudes): formulario Ficha Oficinas segun brief
Reconstruye los campos del servicio 'Ficha y Publicaciones - Oficinas'
segun Brief_Oficinas.docx, manteniendo el estilo Nexus (tarjetas) y el
campo Prioridad (Baja/Media/Alta/Urgente). Agrega validacion generica de
campos obligatorios en submitSolicitud. Actualiza guia (v1.1).
</commit_message>
<xml_diff>
--- a/docs/manuales/Guia_Solicitudes.docx
+++ b/docs/manuales/Guia_Solicitudes.docx
@@ -80,7 +80,7 @@
           <w:color w:val="56648F"/>
           <w:sz w:val="21"/>
         </w:rPr>
-        <w:t>Versión 1.0   ·   23/07/2026</w:t>
+        <w:t>Versión 1.1   ·   23/07/2026</w:t>
       </w:r>
     </w:p>
     <w:p/>
@@ -249,6 +249,39 @@
           <w:color w:val="00285A"/>
           <w:sz w:val="23"/>
         </w:rPr>
+        <w:t>Prioridad</w:t>
+      </w:r>
+    </w:p>
+    <w:p>
+      <w:r>
+        <w:rPr>
+          <w:b/>
+          <w:color w:val="1C54F4"/>
+          <w:sz w:val="21"/>
+        </w:rPr>
+        <w:t>Qué ingresar:</w:t>
+      </w:r>
+    </w:p>
+    <w:p>
+      <w:r>
+        <w:t>Definir la urgencia de la solicitud: Baja, Media, Alta o Urgente.</w:t>
+      </w:r>
+    </w:p>
+    <w:p>
+      <w:r>
+        <w:rPr>
+          <w:color w:val="C9D6F0"/>
+        </w:rPr>
+        <w:t>──────────────────────────────────────────────</w:t>
+      </w:r>
+    </w:p>
+    <w:p>
+      <w:r>
+        <w:rPr>
+          <w:b/>
+          <w:color w:val="00285A"/>
+          <w:sz w:val="23"/>
+        </w:rPr>
         <w:t>Formulario (Oficinas)</w:t>
       </w:r>
     </w:p>
@@ -264,7 +297,7 @@
     </w:p>
     <w:p>
       <w:r>
-        <w:t>Se completa por tarjetas: Solicitud, Datos Comerciales, Ubicación, Superficies, Características, Equipamiento (checkboxes), Descripción, Condiciones Comerciales, Documentación y Marketing.</w:t>
+        <w:t>Se completa por tarjetas: Datos de la Solicitud (Prioridad + Fecha de requerimiento), Datos Generales (Tipo de transacción), Ubicación, Superficies y Dimensiones, Características Particulares, Equipamiento y Servicios (checkboxes), Descripción General, Condiciones Comerciales (Cuenta y Propietario) y Documentación y Marketing.</w:t>
       </w:r>
     </w:p>
     <w:p>

</xml_diff>

<commit_message>
feat(solicitudes): ajustes formulario Ficha Oficinas
- Inmueble asociado: buscador inteligente + creacion rapida (direccion + tipo)
  y oferta de completar la ficha del inmueble tras crear la solicitud.
- Equipamiento y Servicios: cada item con opciones Si/No.
- Condiciones comerciales dinamicas segun tipo de operacion (alquiler/venta/ambas).
- Broker(s) a cargo -> Ejecutivo(s) Comercial(es): creador automatico + hasta 2 adicionales.
- Documentacion: carga multiple con tipos Fotografias/Planos/Brochure/Video/Tour Virtual/Render/Otro.
- Descripcion general renombrada; se elimina Comentarios adicionales.
- Guia Centro de Solicitudes v1.2.
</commit_message>
<xml_diff>
--- a/docs/manuales/Guia_Solicitudes.docx
+++ b/docs/manuales/Guia_Solicitudes.docx
@@ -80,7 +80,7 @@
           <w:color w:val="56648F"/>
           <w:sz w:val="21"/>
         </w:rPr>
-        <w:t>Versión 1.1   ·   23/07/2026</w:t>
+        <w:t>Versión 1.2   ·   23/07/2026</w:t>
       </w:r>
     </w:p>
     <w:p/>
@@ -282,7 +282,7 @@
           <w:color w:val="00285A"/>
           <w:sz w:val="23"/>
         </w:rPr>
-        <w:t>Formulario (Oficinas)</w:t>
+        <w:t>Inmueble asociado</w:t>
       </w:r>
     </w:p>
     <w:p>
@@ -297,7 +297,139 @@
     </w:p>
     <w:p>
       <w:r>
-        <w:t>Se completa por tarjetas: Datos de la Solicitud (Prioridad + Fecha de requerimiento), Datos Generales (Tipo de transacción), Ubicación, Superficies y Dimensiones, Características Particulares, Equipamiento y Servicios (checkboxes), Descripción General, Condiciones Comerciales (Cuenta y Propietario) y Documentación y Marketing.</w:t>
+        <w:t>Buscar el inmueble con el buscador inteligente. Si no existe, usar '+ Crear nuevo inmueble' (solo pide Dirección y Tipo). Al enviar la solicitud, el sistema ofrece continuar completando la ficha del inmueble.</w:t>
+      </w:r>
+    </w:p>
+    <w:p>
+      <w:r>
+        <w:rPr>
+          <w:color w:val="C9D6F0"/>
+        </w:rPr>
+        <w:t>──────────────────────────────────────────────</w:t>
+      </w:r>
+    </w:p>
+    <w:p>
+      <w:r>
+        <w:rPr>
+          <w:b/>
+          <w:color w:val="00285A"/>
+          <w:sz w:val="23"/>
+        </w:rPr>
+        <w:t>Tipo de transacción</w:t>
+      </w:r>
+    </w:p>
+    <w:p>
+      <w:r>
+        <w:rPr>
+          <w:b/>
+          <w:color w:val="1C54F4"/>
+          <w:sz w:val="21"/>
+        </w:rPr>
+        <w:t>Qué ingresar:</w:t>
+      </w:r>
+    </w:p>
+    <w:p>
+      <w:r>
+        <w:t>Alquiler, Venta o Ambas. Según lo elegido, en Condiciones Comerciales aparecen solo los precios que correspondan (alquiler y/o venta).</w:t>
+      </w:r>
+    </w:p>
+    <w:p>
+      <w:r>
+        <w:rPr>
+          <w:color w:val="C9D6F0"/>
+        </w:rPr>
+        <w:t>──────────────────────────────────────────────</w:t>
+      </w:r>
+    </w:p>
+    <w:p>
+      <w:r>
+        <w:rPr>
+          <w:b/>
+          <w:color w:val="00285A"/>
+          <w:sz w:val="23"/>
+        </w:rPr>
+        <w:t>Equipamiento y Servicios</w:t>
+      </w:r>
+    </w:p>
+    <w:p>
+      <w:r>
+        <w:rPr>
+          <w:b/>
+          <w:color w:val="1C54F4"/>
+          <w:sz w:val="21"/>
+        </w:rPr>
+        <w:t>Qué ingresar:</w:t>
+      </w:r>
+    </w:p>
+    <w:p>
+      <w:r>
+        <w:t>Para cada servicio (aire acondicionado, ascensor, seguridad, etc.) marcar Sí o No, indicando si el edificio cuenta con él.</w:t>
+      </w:r>
+    </w:p>
+    <w:p>
+      <w:r>
+        <w:rPr>
+          <w:color w:val="C9D6F0"/>
+        </w:rPr>
+        <w:t>──────────────────────────────────────────────</w:t>
+      </w:r>
+    </w:p>
+    <w:p>
+      <w:r>
+        <w:rPr>
+          <w:b/>
+          <w:color w:val="00285A"/>
+          <w:sz w:val="23"/>
+        </w:rPr>
+        <w:t>Ejecutivo(s) Comercial(es) a cargo</w:t>
+      </w:r>
+    </w:p>
+    <w:p>
+      <w:r>
+        <w:rPr>
+          <w:b/>
+          <w:color w:val="1C54F4"/>
+          <w:sz w:val="21"/>
+        </w:rPr>
+        <w:t>Qué ingresar:</w:t>
+      </w:r>
+    </w:p>
+    <w:p>
+      <w:r>
+        <w:t>El usuario que crea la solicitud queda asignado automáticamente como primer ejecutivo. Se pueden agregar hasta 2 ejecutivos adicionales con el selector predictivo.</w:t>
+      </w:r>
+    </w:p>
+    <w:p>
+      <w:r>
+        <w:rPr>
+          <w:color w:val="C9D6F0"/>
+        </w:rPr>
+        <w:t>──────────────────────────────────────────────</w:t>
+      </w:r>
+    </w:p>
+    <w:p>
+      <w:r>
+        <w:rPr>
+          <w:b/>
+          <w:color w:val="00285A"/>
+          <w:sz w:val="23"/>
+        </w:rPr>
+        <w:t>Descripción general</w:t>
+      </w:r>
+    </w:p>
+    <w:p>
+      <w:r>
+        <w:rPr>
+          <w:b/>
+          <w:color w:val="1C54F4"/>
+          <w:sz w:val="21"/>
+        </w:rPr>
+        <w:t>Qué ingresar:</w:t>
+      </w:r>
+    </w:p>
+    <w:p>
+      <w:r>
+        <w:t>Describir el edificio y el entorno. Este texto se usa para la publicación y la ficha.</w:t>
       </w:r>
     </w:p>
     <w:p>
@@ -330,7 +462,7 @@
     </w:p>
     <w:p>
       <w:r>
-        <w:t>Agregar enlaces indicando el tipo: Foto, PDF, Plano, DWG o URL SharePoint.</w:t>
+        <w:t>Agregar todos los elementos necesarios indicando el tipo: Fotografías, Planos, Brochure, Video, Tour Virtual, Render u Otro. Se pueden sumar varios.</w:t>
       </w:r>
     </w:p>
     <w:p>

</xml_diff>

<commit_message>
feat(solicitudes): validacion de superficies + panel lateral con fecha de entrega
- Validacion reutilizable validarSuperficieTotalCubierta (Total >= Cubierta,
  sin negativos, total > 0 si es obligatoria) aplicada en vivo y al enviar.
- Panel izquierdo del ticket: orden Estado, Prioridad, Fecha de creacion,
  Fecha de entrega, Solicitante, Ejecutivos; se elimina Ultima actividad.
- Guia Centro de Solicitudes v1.3.
</commit_message>
<xml_diff>
--- a/docs/manuales/Guia_Solicitudes.docx
+++ b/docs/manuales/Guia_Solicitudes.docx
@@ -80,7 +80,7 @@
           <w:color w:val="56648F"/>
           <w:sz w:val="21"/>
         </w:rPr>
-        <w:t>Versión 1.2   ·   23/07/2026</w:t>
+        <w:t>Versión 1.3   ·   23/07/2026</w:t>
       </w:r>
     </w:p>
     <w:p/>
@@ -397,6 +397,72 @@
     <w:p>
       <w:r>
         <w:t>El usuario que crea la solicitud queda asignado automáticamente como primer ejecutivo. Se pueden agregar hasta 2 ejecutivos adicionales con el selector predictivo.</w:t>
+      </w:r>
+    </w:p>
+    <w:p>
+      <w:r>
+        <w:rPr>
+          <w:color w:val="C9D6F0"/>
+        </w:rPr>
+        <w:t>──────────────────────────────────────────────</w:t>
+      </w:r>
+    </w:p>
+    <w:p>
+      <w:r>
+        <w:rPr>
+          <w:b/>
+          <w:color w:val="00285A"/>
+          <w:sz w:val="23"/>
+        </w:rPr>
+        <w:t>Superficies</w:t>
+      </w:r>
+    </w:p>
+    <w:p>
+      <w:r>
+        <w:rPr>
+          <w:b/>
+          <w:color w:val="1C54F4"/>
+          <w:sz w:val="21"/>
+        </w:rPr>
+        <w:t>Qué ingresar:</w:t>
+      </w:r>
+    </w:p>
+    <w:p>
+      <w:r>
+        <w:t>La Superficie Total debe ser mayor o igual a la Superficie Cubierta (pueden ser iguales). No se permiten valores negativos ni una superficie total en cero. Si no se cumple, el sistema resalta los campos y no deja enviar.</w:t>
+      </w:r>
+    </w:p>
+    <w:p>
+      <w:r>
+        <w:rPr>
+          <w:color w:val="C9D6F0"/>
+        </w:rPr>
+        <w:t>──────────────────────────────────────────────</w:t>
+      </w:r>
+    </w:p>
+    <w:p>
+      <w:r>
+        <w:rPr>
+          <w:b/>
+          <w:color w:val="00285A"/>
+          <w:sz w:val="23"/>
+        </w:rPr>
+        <w:t>Fecha de requerimiento / entrega</w:t>
+      </w:r>
+    </w:p>
+    <w:p>
+      <w:r>
+        <w:rPr>
+          <w:b/>
+          <w:color w:val="1C54F4"/>
+          <w:sz w:val="21"/>
+        </w:rPr>
+        <w:t>Qué ingresar:</w:t>
+      </w:r>
+    </w:p>
+    <w:p>
+      <w:r>
+        <w:t>La fecha comprometida que se ingresa en el formulario se muestra luego como 'Fecha de entrega' en el panel lateral de la solicitud.</w:t>
       </w:r>
     </w:p>
     <w:p>

</xml_diff>

<commit_message>
feat(solicitudes): propietario obligatorio con contacto registrado + ajustes de labels
- Campo Inmueble: titulo simplificado a 'Inmueble'.
- Se elimina el campo 'Referencias del entorno' (se integra en Descripcion general).
- Campo Propietario: titulo simplificado a 'Propietario'.
- Propietario obligatorio, siempre vinculado a un Contacto de Nexus; buscador
  con '+ Crear nuevo contacto' (datos minimos) que queda vinculado y seleccionado.
  Tras enviar, se ofrece completar la ficha del contacto. Sin texto libre.
- Guia Centro de Solicitudes v1.4.
</commit_message>
<xml_diff>
--- a/docs/manuales/Guia_Solicitudes.docx
+++ b/docs/manuales/Guia_Solicitudes.docx
@@ -80,7 +80,7 @@
           <w:color w:val="56648F"/>
           <w:sz w:val="21"/>
         </w:rPr>
-        <w:t>Versión 1.3   ·   23/07/2026</w:t>
+        <w:t>Versión 1.4   ·   23/07/2026</w:t>
       </w:r>
     </w:p>
     <w:p/>
@@ -231,7 +231,7 @@
     </w:p>
     <w:p>
       <w:r>
-        <w:t>Seleccionar un Contacto existente (no se escribe texto libre).</w:t>
+        <w:t>Obligatorio y siempre asociado a un Contacto de Nexus (no se admite texto libre). Buscar el contacto; si no existe, usar '+ Crear nuevo contacto' (pide datos mínimos) y queda vinculado como propietario. Al enviar, el sistema ofrece completar luego la ficha del contacto.</w:t>
       </w:r>
     </w:p>
     <w:p>

</xml_diff>

<commit_message>
feat(solicitudes): campo Especificaciones de los equipos (texto libre + PDF)
- Nueva seccion/campo textarea opcional debajo de Equipamiento y Servicios,
  con placeholder de ejemplo.
- Conserva saltos de linea al guardar, en el detalle y en el PDF
  (seccion propia con white-space:pre-wrap).
- Guia Centro de Solicitudes v1.5.
</commit_message>
<xml_diff>
--- a/docs/manuales/Guia_Solicitudes.docx
+++ b/docs/manuales/Guia_Solicitudes.docx
@@ -80,7 +80,7 @@
           <w:color w:val="56648F"/>
           <w:sz w:val="21"/>
         </w:rPr>
-        <w:t>Versión 1.4   ·   23/07/2026</w:t>
+        <w:t>Versión 1.5   ·   23/07/2026</w:t>
       </w:r>
     </w:p>
     <w:p/>
@@ -364,6 +364,39 @@
     <w:p>
       <w:r>
         <w:t>Para cada servicio (aire acondicionado, ascensor, seguridad, etc.) marcar Sí o No, indicando si el edificio cuenta con él.</w:t>
+      </w:r>
+    </w:p>
+    <w:p>
+      <w:r>
+        <w:rPr>
+          <w:color w:val="C9D6F0"/>
+        </w:rPr>
+        <w:t>──────────────────────────────────────────────</w:t>
+      </w:r>
+    </w:p>
+    <w:p>
+      <w:r>
+        <w:rPr>
+          <w:b/>
+          <w:color w:val="00285A"/>
+          <w:sz w:val="23"/>
+        </w:rPr>
+        <w:t>Especificaciones de los equipos</w:t>
+      </w:r>
+    </w:p>
+    <w:p>
+      <w:r>
+        <w:rPr>
+          <w:b/>
+          <w:color w:val="1C54F4"/>
+          <w:sz w:val="21"/>
+        </w:rPr>
+        <w:t>Qué ingresar:</w:t>
+      </w:r>
+    </w:p>
+    <w:p>
+      <w:r>
+        <w:t>Campo de texto libre y opcional, debajo de Equipamiento y Servicios. Detallar características técnicas que no se representan con Sí/No (tipo de aire, capacidad del grupo electrógeno, cantidad de ascensores, certificaciones, etc.). Admite varias líneas y se incluye en el PDF.</w:t>
       </w:r>
     </w:p>
     <w:p>

</xml_diff>

<commit_message>
feat(solicitudes): flujo escalable Servicio -> Tipo de inmueble -> Formulario
- Nueva Solicitud abre un wizard en 2 pasos: Paso 1 seleccion de Servicio
  (Ficha y Publicaciones; futuros Marketing/Research/Sistemas/RRHH/Admin/Legales
  como 'Proximamente'); Paso 2 seleccion de tipo de inmueble (Oficinas activo;
  Retail e Industria y Logistica preparados como 'Proximamente').
- Estructura SR_CATALOG (servicio -> categorias -> serviceKey) reutilizando el
  mismo motor SR_SERVICES; solo Oficinas desarrollado. Sin duplicar componentes.
- Guia Centro de Solicitudes v1.6.
</commit_message>
<xml_diff>
--- a/docs/manuales/Guia_Solicitudes.docx
+++ b/docs/manuales/Guia_Solicitudes.docx
@@ -80,7 +80,7 @@
           <w:color w:val="56648F"/>
           <w:sz w:val="21"/>
         </w:rPr>
-        <w:t>Versión 1.5   ·   23/07/2026</w:t>
+        <w:t>Versión 1.6   ·   23/07/2026</w:t>
       </w:r>
     </w:p>
     <w:p/>
@@ -132,7 +132,7 @@
     </w:p>
     <w:p>
       <w:r>
-        <w:t>Abre el catálogo de servicios. Elegí el servicio (por ahora: Ficha y Publicaciones – Oficinas).</w:t>
+        <w:t>El alta se hace en dos pasos: 1) elegir el Servicio (por ahora 'Ficha y Publicaciones'); 2) elegir el Tipo de inmueble (Oficinas, Retail o Industria y Logística). En esta etapa solo está disponible Oficinas; el resto figura como 'Próximamente'. Según la opción elegida se abre el formulario correspondiente.</w:t>
       </w:r>
     </w:p>
     <w:p>

</xml_diff>

<commit_message>
feat(solicitudes): formulario Ficha y Publicaciones como wizard paso a paso
- Reemplaza el formulario largo con scroll por un wizard guiado (mismo patrón
  que el alta de Oficinas): barra de progreso numerada, pasos, botones
  Atrás/Siguiente/Finalizar y validación por paso.
- 6 pasos: 1) Información General (inmueble, ubicación, cuenta/propietario/
  ejecutivos, prioridad, fecha de entrega), 2) Información Comercial (operación,
  precios dinámicos, superficies), 3) Características (equipamiento Sí/No,
  especificaciones), 4) Marketing (descripción, documentación múltiple),
  5) Revisión (resumen + volver a cualquier paso), 6) Confirmación con número.
- Reutiliza el motor schema-driven (mismos campos, _srReadForm, _srRenderData,
  submitSolicitud, PDF, timeline y emails): sin duplicar componentes y sin
  perder información al navegar (todos los campos permanecen en el DOM).
- El PDF y la creación de la solicitud mantienen el mismo contenido y flujo.
- Guia Centro de Solicitudes v1.7.
</commit_message>
<xml_diff>
--- a/docs/manuales/Guia_Solicitudes.docx
+++ b/docs/manuales/Guia_Solicitudes.docx
@@ -80,7 +80,7 @@
           <w:color w:val="56648F"/>
           <w:sz w:val="21"/>
         </w:rPr>
-        <w:t>Versión 1.6   ·   23/07/2026</w:t>
+        <w:t>Versión 1.7   ·   23/07/2026</w:t>
       </w:r>
     </w:p>
     <w:p/>
@@ -133,6 +133,39 @@
     <w:p>
       <w:r>
         <w:t>El alta se hace en dos pasos: 1) elegir el Servicio (por ahora 'Ficha y Publicaciones'); 2) elegir el Tipo de inmueble (Oficinas, Retail o Industria y Logística). En esta etapa solo está disponible Oficinas; el resto figura como 'Próximamente'. Según la opción elegida se abre el formulario correspondiente.</w:t>
+      </w:r>
+    </w:p>
+    <w:p>
+      <w:r>
+        <w:rPr>
+          <w:color w:val="C9D6F0"/>
+        </w:rPr>
+        <w:t>──────────────────────────────────────────────</w:t>
+      </w:r>
+    </w:p>
+    <w:p>
+      <w:r>
+        <w:rPr>
+          <w:b/>
+          <w:color w:val="00285A"/>
+          <w:sz w:val="23"/>
+        </w:rPr>
+        <w:t>Carga guiada (wizard)</w:t>
+      </w:r>
+    </w:p>
+    <w:p>
+      <w:r>
+        <w:rPr>
+          <w:b/>
+          <w:color w:val="1C54F4"/>
+          <w:sz w:val="21"/>
+        </w:rPr>
+        <w:t>Qué ingresar:</w:t>
+      </w:r>
+    </w:p>
+    <w:p>
+      <w:r>
+        <w:t>El formulario de 'Ficha y Publicaciones – Oficinas' se completa en pasos, con la misma experiencia que el alta de Oficinas: 1) Información General, 2) Información Comercial, 3) Características, 4) Marketing, 5) Revisión y 6) Confirmación. Arriba se ve una barra de progreso; se avanza con 'Siguiente' y se puede volver con 'Atrás' sin perder datos. Cada paso valida solo sus campos obligatorios; no deja avanzar si faltan. En Revisión se ve el resumen y se puede volver a cualquier paso para corregir; al 'Finalizar' se genera la solicitud, el PDF, el historial y el aviso al responsable, y aparece la pantalla de confirmación con el número de solicitud.</w:t>
       </w:r>
     </w:p>
     <w:p>

</xml_diff>

<commit_message>
Actividades de Marketing & Research: renombra el modulo, separa Registrar actividad (solo comercial) y completa el formulario base
- Renombra Centro de Solicitudes -> Actividades de Marketing & Research en sidebar, titulos, breadcrumb, boton de volver y PDF
- Unidad de negocio por usuario: _srUsuarioBUs() la toma del padron de usuarios y, en su defecto, de las oportunidades del usuario; una sola BU se preselecciona, varias se ofrecen agrupadas
- Registrar actividad queda exclusivamente comercial: sin catalogo de Marketing & Research, validacion de tipos y acceso directo al modulo de M&R
- La solicitud guarda cuenta/contacto/tipo de actividad provenientes del formulario base en un unico documento de la coleccion existente
- Guia de usuario actualizada a 2.0 con el nuevo flujo

Co-Authored-By: Claude Opus 5 <noreply@anthropic.com>
Claude-Session: https://claude.ai/code/session_01JkU9BrFwXYbLVUvW55gcE9
</commit_message>
<xml_diff>
--- a/docs/manuales/Guia_Solicitudes.docx
+++ b/docs/manuales/Guia_Solicitudes.docx
@@ -68,7 +68,7 @@
           <w:color w:val="00285A"/>
           <w:sz w:val="40"/>
         </w:rPr>
-        <w:t>Manual de Usuario - Centro de Solicitudes</w:t>
+        <w:t>Manual de Usuario - Actividades de Marketing &amp; Research</w:t>
       </w:r>
     </w:p>
     <w:p>
@@ -80,7 +80,7 @@
           <w:color w:val="56648F"/>
           <w:sz w:val="21"/>
         </w:rPr>
-        <w:t>Versión 1.7   ·   23/07/2026</w:t>
+        <w:t>Versión 2.0   ·   21/08/2026</w:t>
       </w:r>
     </w:p>
     <w:p/>
@@ -96,7 +96,7 @@
     </w:p>
     <w:p>
       <w:r>
-        <w:t>Centraliza las solicitudes internas de todas las áreas de Colliers. Cada servicio tiene su propio formulario; el primero disponible es 'Ficha y Publicaciones – Oficinas'. Al enviar se genera un Ticket, se puede descargar un PDF corporativo y se notifica al responsable.</w:t>
+        <w:t>Es el lugar desde donde se piden los trabajos a Marketing &amp; Research (fichas, publicaciones y demás actividades del área). Se completa primero un Formulario Base con los datos comunes y luego el formulario específico de la actividad elegida. Al enviar se genera un Ticket, se puede descargar un PDF corporativo y se notifica al responsable.</w:t>
       </w:r>
     </w:p>
     <w:p/>
@@ -117,7 +117,7 @@
           <w:color w:val="00285A"/>
           <w:sz w:val="23"/>
         </w:rPr>
-        <w:t>Nueva Solicitud</w:t>
+        <w:t>Formulario Base</w:t>
       </w:r>
     </w:p>
     <w:p>
@@ -132,7 +132,7 @@
     </w:p>
     <w:p>
       <w:r>
-        <w:t>El alta se hace en dos pasos: 1) elegir el Servicio (por ahora 'Ficha y Publicaciones'); 2) elegir el Tipo de inmueble (Oficinas, Retail o Industria y Logística). En esta etapa solo está disponible Oficinas; el resto figura como 'Próximamente'. Según la opción elegida se abre el formulario correspondiente.</w:t>
+        <w:t>Toda solicitud arranca por el Formulario Base. Ahí se cargan los datos comunes a cualquier actividad; después se continúa al formulario específico, que ya no vuelve a pedirlos.</w:t>
       </w:r>
     </w:p>
     <w:p>
@@ -150,7 +150,7 @@
           <w:color w:val="00285A"/>
           <w:sz w:val="23"/>
         </w:rPr>
-        <w:t>Carga guiada (wizard)</w:t>
+        <w:t>Tipo de actividad</w:t>
       </w:r>
     </w:p>
     <w:p>
@@ -165,7 +165,7 @@
     </w:p>
     <w:p>
       <w:r>
-        <w:t>El formulario de 'Ficha y Publicaciones – Oficinas' se completa en pasos, con la misma experiencia que el alta de Oficinas: 1) Información General, 2) Información Comercial, 3) Características, 4) Marketing, 5) Revisión y 6) Confirmación. Arriba se ve una barra de progreso; se avanza con 'Siguiente' y se puede volver con 'Atrás' sin perder datos. Cada paso valida solo sus campos obligatorios; no deja avanzar si faltan. En Revisión se ve el resumen y se puede volver a cualquier paso para corregir; al 'Finalizar' se genera la solicitud, el PDF, el historial y el aviso al responsable, y aparece la pantalla de confirmación con el número de solicitud.</w:t>
+        <w:t>Qué ingresar: elegir la actividad de Marketing &amp; Research que se necesita (por ejemplo, Ficha y Publicaciones – Oficinas). Arranca en 'Seleccionar' y define a qué formulario específico se continúa.</w:t>
       </w:r>
     </w:p>
     <w:p>
@@ -183,7 +183,7 @@
           <w:color w:val="00285A"/>
           <w:sz w:val="23"/>
         </w:rPr>
-        <w:t>Datos automáticos</w:t>
+        <w:t>Prioridad</w:t>
       </w:r>
     </w:p>
     <w:p>
@@ -198,7 +198,7 @@
     </w:p>
     <w:p>
       <w:r>
-        <w:t>Solicitante, Broker y Fecha se toman solos del usuario logueado; no hay que cargarlos.</w:t>
+        <w:t>Qué ingresar: la urgencia de la solicitud: Baja, Media o Alta.</w:t>
       </w:r>
     </w:p>
     <w:p>
@@ -231,7 +231,7 @@
     </w:p>
     <w:p>
       <w:r>
-        <w:t>Buscar la cuenta con el buscador inteligente. Si no existe, se puede crear en el momento (mismo flujo que en el resto de Nexus).</w:t>
+        <w:t>Qué ingresar: buscar la cuenta con el buscador inteligente. Es opcional, pero conviene indicarla para que el equipo tenga contexto.</w:t>
       </w:r>
     </w:p>
     <w:p>
@@ -249,7 +249,7 @@
           <w:color w:val="00285A"/>
           <w:sz w:val="23"/>
         </w:rPr>
-        <w:t>Propietario</w:t>
+        <w:t>Contacto</w:t>
       </w:r>
     </w:p>
     <w:p>
@@ -264,7 +264,7 @@
     </w:p>
     <w:p>
       <w:r>
-        <w:t>Obligatorio y siempre asociado a un Contacto de Nexus (no se admite texto libre). Buscar el contacto; si no existe, usar '+ Crear nuevo contacto' (pide datos mínimos) y queda vinculado como propietario. Al enviar, el sistema ofrece completar luego la ficha del contacto.</w:t>
+        <w:t>Qué ingresar: buscar la persona de contacto. Si se elige un contacto que ya tiene cuenta, la cuenta se completa sola.</w:t>
       </w:r>
     </w:p>
     <w:p>
@@ -282,7 +282,7 @@
           <w:color w:val="00285A"/>
           <w:sz w:val="23"/>
         </w:rPr>
-        <w:t>Prioridad</w:t>
+        <w:t>Oportunidad</w:t>
       </w:r>
     </w:p>
     <w:p>
@@ -297,7 +297,7 @@
     </w:p>
     <w:p>
       <w:r>
-        <w:t>Definir la urgencia de la solicitud: Baja, Media, Alta o Urgente.</w:t>
+        <w:t>Qué ingresar: si el pedido corresponde a una oportunidad vigente de esa cuenta, elegirla de la lista.</w:t>
       </w:r>
     </w:p>
     <w:p>
@@ -315,7 +315,7 @@
           <w:color w:val="00285A"/>
           <w:sz w:val="23"/>
         </w:rPr>
-        <w:t>Inmueble asociado</w:t>
+        <w:t>Unidad de negocio</w:t>
       </w:r>
     </w:p>
     <w:p>
@@ -330,7 +330,238 @@
     </w:p>
     <w:p>
       <w:r>
-        <w:t>Buscar el inmueble con el buscador inteligente. Si no existe, usar '+ Crear nuevo inmueble' (solo pide Dirección y Tipo). Al enviar la solicitud, el sistema ofrece continuar completando la ficha del inmueble.</w:t>
+        <w:t>Qué ingresar: Oficinas, Industrias, Retail, Terrenos, SPS, Valuaciones, Consultorías o Desinversión. Si el usuario tiene una sola unidad, viene cargada; si tiene varias, aparecen primero las suyas para elegir.</w:t>
+      </w:r>
+    </w:p>
+    <w:p>
+      <w:r>
+        <w:rPr>
+          <w:color w:val="C9D6F0"/>
+        </w:rPr>
+        <w:t>──────────────────────────────────────────────</w:t>
+      </w:r>
+    </w:p>
+    <w:p>
+      <w:r>
+        <w:rPr>
+          <w:b/>
+          <w:color w:val="00285A"/>
+          <w:sz w:val="23"/>
+        </w:rPr>
+        <w:t>Comentarios</w:t>
+      </w:r>
+    </w:p>
+    <w:p>
+      <w:r>
+        <w:rPr>
+          <w:b/>
+          <w:color w:val="1C54F4"/>
+          <w:sz w:val="21"/>
+        </w:rPr>
+        <w:t>Qué ingresar:</w:t>
+      </w:r>
+    </w:p>
+    <w:p>
+      <w:r>
+        <w:t>Qué ingresar: opcional. Cualquier comentario o información adicional para Marketing &amp; Research.</w:t>
+      </w:r>
+    </w:p>
+    <w:p>
+      <w:r>
+        <w:rPr>
+          <w:color w:val="C9D6F0"/>
+        </w:rPr>
+        <w:t>──────────────────────────────────────────────</w:t>
+      </w:r>
+    </w:p>
+    <w:p>
+      <w:r>
+        <w:rPr>
+          <w:b/>
+          <w:color w:val="00285A"/>
+          <w:sz w:val="23"/>
+        </w:rPr>
+        <w:t>Fecha de solicitud</w:t>
+      </w:r>
+    </w:p>
+    <w:p>
+      <w:r>
+        <w:rPr>
+          <w:b/>
+          <w:color w:val="1C54F4"/>
+          <w:sz w:val="21"/>
+        </w:rPr>
+        <w:t>Qué ingresar:</w:t>
+      </w:r>
+    </w:p>
+    <w:p>
+      <w:r>
+        <w:t>Se completa sola con la fecha del día. No hay que cargarla.</w:t>
+      </w:r>
+    </w:p>
+    <w:p>
+      <w:r>
+        <w:rPr>
+          <w:color w:val="C9D6F0"/>
+        </w:rPr>
+        <w:t>──────────────────────────────────────────────</w:t>
+      </w:r>
+    </w:p>
+    <w:p>
+      <w:r>
+        <w:rPr>
+          <w:b/>
+          <w:color w:val="00285A"/>
+          <w:sz w:val="23"/>
+        </w:rPr>
+        <w:t>Fecha de vencimiento</w:t>
+      </w:r>
+    </w:p>
+    <w:p>
+      <w:r>
+        <w:rPr>
+          <w:b/>
+          <w:color w:val="1C54F4"/>
+          <w:sz w:val="21"/>
+        </w:rPr>
+        <w:t>Qué ingresar:</w:t>
+      </w:r>
+    </w:p>
+    <w:p>
+      <w:r>
+        <w:t>Se calcula sola según el tipo de actividad, contando días hábiles (no cuenta sábados ni domingos). Para Ficha son 3 días hábiles: si se pide un lunes, vence el jueves. Si la actividad todavía no tiene plazo definido, queda sin fecha.</w:t>
+      </w:r>
+    </w:p>
+    <w:p>
+      <w:r>
+        <w:rPr>
+          <w:color w:val="C9D6F0"/>
+        </w:rPr>
+        <w:t>──────────────────────────────────────────────</w:t>
+      </w:r>
+    </w:p>
+    <w:p>
+      <w:r>
+        <w:rPr>
+          <w:b/>
+          <w:color w:val="00285A"/>
+          <w:sz w:val="23"/>
+        </w:rPr>
+        <w:t>Solicitada por</w:t>
+      </w:r>
+    </w:p>
+    <w:p>
+      <w:r>
+        <w:rPr>
+          <w:b/>
+          <w:color w:val="1C54F4"/>
+          <w:sz w:val="21"/>
+        </w:rPr>
+        <w:t>Qué ingresar:</w:t>
+      </w:r>
+    </w:p>
+    <w:p>
+      <w:r>
+        <w:t>Se completa sola con el usuario logueado y no se puede modificar.</w:t>
+      </w:r>
+    </w:p>
+    <w:p>
+      <w:r>
+        <w:rPr>
+          <w:color w:val="C9D6F0"/>
+        </w:rPr>
+        <w:t>──────────────────────────────────────────────</w:t>
+      </w:r>
+    </w:p>
+    <w:p>
+      <w:r>
+        <w:rPr>
+          <w:b/>
+          <w:color w:val="00285A"/>
+          <w:sz w:val="23"/>
+        </w:rPr>
+        <w:t>Formulario específico (carga guiada)</w:t>
+      </w:r>
+    </w:p>
+    <w:p>
+      <w:r>
+        <w:rPr>
+          <w:b/>
+          <w:color w:val="1C54F4"/>
+          <w:sz w:val="21"/>
+        </w:rPr>
+        <w:t>Qué ingresar:</w:t>
+      </w:r>
+    </w:p>
+    <w:p>
+      <w:r>
+        <w:t>Al continuar se abre el formulario de la actividad elegida, en pasos: 1) Información General, 2) Información Comercial, 3) Contenido, 4) Características, 5) Comentarios y 6) Revisión. Se avanza con 'Siguiente' y se vuelve con 'Atrás' sin perder datos. Cada paso valida sus obligatorios. Los datos ya cargados en el Formulario Base no se vuelven a pedir.</w:t>
+      </w:r>
+    </w:p>
+    <w:p>
+      <w:r>
+        <w:rPr>
+          <w:color w:val="C9D6F0"/>
+        </w:rPr>
+        <w:t>──────────────────────────────────────────────</w:t>
+      </w:r>
+    </w:p>
+    <w:p>
+      <w:r>
+        <w:rPr>
+          <w:b/>
+          <w:color w:val="00285A"/>
+          <w:sz w:val="23"/>
+        </w:rPr>
+        <w:t>Solo Ficha o Ficha + Publicación</w:t>
+      </w:r>
+    </w:p>
+    <w:p>
+      <w:r>
+        <w:rPr>
+          <w:b/>
+          <w:color w:val="1C54F4"/>
+          <w:sz w:val="21"/>
+        </w:rPr>
+        <w:t>Qué ingresar:</w:t>
+      </w:r>
+    </w:p>
+    <w:p>
+      <w:r>
+        <w:t>En el paso 3 se puede enviar la solicitud solo como Ficha, o seguir completando para pedir también la Publicación.</w:t>
+      </w:r>
+    </w:p>
+    <w:p>
+      <w:r>
+        <w:rPr>
+          <w:color w:val="C9D6F0"/>
+        </w:rPr>
+        <w:t>──────────────────────────────────────────────</w:t>
+      </w:r>
+    </w:p>
+    <w:p>
+      <w:r>
+        <w:rPr>
+          <w:b/>
+          <w:color w:val="00285A"/>
+          <w:sz w:val="23"/>
+        </w:rPr>
+        <w:t>Cuenta / Propietario / Inmueble</w:t>
+      </w:r>
+    </w:p>
+    <w:p>
+      <w:r>
+        <w:rPr>
+          <w:b/>
+          <w:color w:val="1C54F4"/>
+          <w:sz w:val="21"/>
+        </w:rPr>
+        <w:t>Qué ingresar:</w:t>
+      </w:r>
+    </w:p>
+    <w:p>
+      <w:r>
+        <w:t>El propietario se asocia siempre a un Contacto de Nexus; si no existe se lo puede crear en el momento. Lo mismo con el inmueble ('+ Crear nuevo inmueble', pide Dirección y Tipo).</w:t>
       </w:r>
     </w:p>
     <w:p>
@@ -363,7 +594,40 @@
     </w:p>
     <w:p>
       <w:r>
-        <w:t>Alquiler, Venta o Ambas. Según lo elegido, en Condiciones Comerciales aparecen solo los precios que correspondan (alquiler y/o venta).</w:t>
+        <w:t>Qué ingresar: Alquiler, Venta o Ambas. Según lo elegido aparecen solo los precios que correspondan.</w:t>
+      </w:r>
+    </w:p>
+    <w:p>
+      <w:r>
+        <w:rPr>
+          <w:color w:val="C9D6F0"/>
+        </w:rPr>
+        <w:t>──────────────────────────────────────────────</w:t>
+      </w:r>
+    </w:p>
+    <w:p>
+      <w:r>
+        <w:rPr>
+          <w:b/>
+          <w:color w:val="00285A"/>
+          <w:sz w:val="23"/>
+        </w:rPr>
+        <w:t>Superficies</w:t>
+      </w:r>
+    </w:p>
+    <w:p>
+      <w:r>
+        <w:rPr>
+          <w:b/>
+          <w:color w:val="1C54F4"/>
+          <w:sz w:val="21"/>
+        </w:rPr>
+        <w:t>Qué ingresar:</w:t>
+      </w:r>
+    </w:p>
+    <w:p>
+      <w:r>
+        <w:t>La Superficie Total debe ser mayor o igual a la Superficie Cubierta. No se admiten valores negativos ni total en cero.</w:t>
       </w:r>
     </w:p>
     <w:p>
@@ -396,7 +660,7 @@
     </w:p>
     <w:p>
       <w:r>
-        <w:t>Para cada servicio (aire acondicionado, ascensor, seguridad, etc.) marcar Sí o No, indicando si el edificio cuenta con él.</w:t>
+        <w:t>Para cada servicio (aire acondicionado, ascensor, seguridad, etc.) marcar Sí o No. Debajo, 'Especificaciones de los equipos' permite detallar lo que no se resuelve con Sí/No.</w:t>
       </w:r>
     </w:p>
     <w:p>
@@ -414,7 +678,7 @@
           <w:color w:val="00285A"/>
           <w:sz w:val="23"/>
         </w:rPr>
-        <w:t>Especificaciones de los equipos</w:t>
+        <w:t>Descripción, Documentación y Acciones de Marketing</w:t>
       </w:r>
     </w:p>
     <w:p>
@@ -429,205 +693,7 @@
     </w:p>
     <w:p>
       <w:r>
-        <w:t>Campo de texto libre y opcional, debajo de Equipamiento y Servicios. Detallar características técnicas que no se representan con Sí/No (tipo de aire, capacidad del grupo electrógeno, cantidad de ascensores, certificaciones, etc.). Admite varias líneas y se incluye en el PDF.</w:t>
-      </w:r>
-    </w:p>
-    <w:p>
-      <w:r>
-        <w:rPr>
-          <w:color w:val="C9D6F0"/>
-        </w:rPr>
-        <w:t>──────────────────────────────────────────────</w:t>
-      </w:r>
-    </w:p>
-    <w:p>
-      <w:r>
-        <w:rPr>
-          <w:b/>
-          <w:color w:val="00285A"/>
-          <w:sz w:val="23"/>
-        </w:rPr>
-        <w:t>Ejecutivo(s) Comercial(es) a cargo</w:t>
-      </w:r>
-    </w:p>
-    <w:p>
-      <w:r>
-        <w:rPr>
-          <w:b/>
-          <w:color w:val="1C54F4"/>
-          <w:sz w:val="21"/>
-        </w:rPr>
-        <w:t>Qué ingresar:</w:t>
-      </w:r>
-    </w:p>
-    <w:p>
-      <w:r>
-        <w:t>El usuario que crea la solicitud queda asignado automáticamente como primer ejecutivo. Se pueden agregar hasta 2 ejecutivos adicionales con el selector predictivo.</w:t>
-      </w:r>
-    </w:p>
-    <w:p>
-      <w:r>
-        <w:rPr>
-          <w:color w:val="C9D6F0"/>
-        </w:rPr>
-        <w:t>──────────────────────────────────────────────</w:t>
-      </w:r>
-    </w:p>
-    <w:p>
-      <w:r>
-        <w:rPr>
-          <w:b/>
-          <w:color w:val="00285A"/>
-          <w:sz w:val="23"/>
-        </w:rPr>
-        <w:t>Superficies</w:t>
-      </w:r>
-    </w:p>
-    <w:p>
-      <w:r>
-        <w:rPr>
-          <w:b/>
-          <w:color w:val="1C54F4"/>
-          <w:sz w:val="21"/>
-        </w:rPr>
-        <w:t>Qué ingresar:</w:t>
-      </w:r>
-    </w:p>
-    <w:p>
-      <w:r>
-        <w:t>La Superficie Total debe ser mayor o igual a la Superficie Cubierta (pueden ser iguales). No se permiten valores negativos ni una superficie total en cero. Si no se cumple, el sistema resalta los campos y no deja enviar.</w:t>
-      </w:r>
-    </w:p>
-    <w:p>
-      <w:r>
-        <w:rPr>
-          <w:color w:val="C9D6F0"/>
-        </w:rPr>
-        <w:t>──────────────────────────────────────────────</w:t>
-      </w:r>
-    </w:p>
-    <w:p>
-      <w:r>
-        <w:rPr>
-          <w:b/>
-          <w:color w:val="00285A"/>
-          <w:sz w:val="23"/>
-        </w:rPr>
-        <w:t>Fecha de requerimiento / entrega</w:t>
-      </w:r>
-    </w:p>
-    <w:p>
-      <w:r>
-        <w:rPr>
-          <w:b/>
-          <w:color w:val="1C54F4"/>
-          <w:sz w:val="21"/>
-        </w:rPr>
-        <w:t>Qué ingresar:</w:t>
-      </w:r>
-    </w:p>
-    <w:p>
-      <w:r>
-        <w:t>La fecha comprometida que se ingresa en el formulario se muestra luego como 'Fecha de entrega' en el panel lateral de la solicitud.</w:t>
-      </w:r>
-    </w:p>
-    <w:p>
-      <w:r>
-        <w:rPr>
-          <w:color w:val="C9D6F0"/>
-        </w:rPr>
-        <w:t>──────────────────────────────────────────────</w:t>
-      </w:r>
-    </w:p>
-    <w:p>
-      <w:r>
-        <w:rPr>
-          <w:b/>
-          <w:color w:val="00285A"/>
-          <w:sz w:val="23"/>
-        </w:rPr>
-        <w:t>Descripción general</w:t>
-      </w:r>
-    </w:p>
-    <w:p>
-      <w:r>
-        <w:rPr>
-          <w:b/>
-          <w:color w:val="1C54F4"/>
-          <w:sz w:val="21"/>
-        </w:rPr>
-        <w:t>Qué ingresar:</w:t>
-      </w:r>
-    </w:p>
-    <w:p>
-      <w:r>
-        <w:t>Describir el edificio y el entorno. Este texto se usa para la publicación y la ficha.</w:t>
-      </w:r>
-    </w:p>
-    <w:p>
-      <w:r>
-        <w:rPr>
-          <w:color w:val="C9D6F0"/>
-        </w:rPr>
-        <w:t>──────────────────────────────────────────────</w:t>
-      </w:r>
-    </w:p>
-    <w:p>
-      <w:r>
-        <w:rPr>
-          <w:b/>
-          <w:color w:val="00285A"/>
-          <w:sz w:val="23"/>
-        </w:rPr>
-        <w:t>Documentación</w:t>
-      </w:r>
-    </w:p>
-    <w:p>
-      <w:r>
-        <w:rPr>
-          <w:b/>
-          <w:color w:val="1C54F4"/>
-          <w:sz w:val="21"/>
-        </w:rPr>
-        <w:t>Qué ingresar:</w:t>
-      </w:r>
-    </w:p>
-    <w:p>
-      <w:r>
-        <w:t>Agregar todos los elementos necesarios indicando el tipo: Fotografías, Planos, Brochure, Video, Tour Virtual, Render u Otro. Se pueden sumar varios.</w:t>
-      </w:r>
-    </w:p>
-    <w:p>
-      <w:r>
-        <w:rPr>
-          <w:color w:val="C9D6F0"/>
-        </w:rPr>
-        <w:t>──────────────────────────────────────────────</w:t>
-      </w:r>
-    </w:p>
-    <w:p>
-      <w:r>
-        <w:rPr>
-          <w:b/>
-          <w:color w:val="00285A"/>
-          <w:sz w:val="23"/>
-        </w:rPr>
-        <w:t>Acciones de Marketing</w:t>
-      </w:r>
-    </w:p>
-    <w:p>
-      <w:r>
-        <w:rPr>
-          <w:b/>
-          <w:color w:val="1C54F4"/>
-          <w:sz w:val="21"/>
-        </w:rPr>
-        <w:t>Qué ingresar:</w:t>
-      </w:r>
-    </w:p>
-    <w:p>
-      <w:r>
-        <w:t>Selección múltiple: Ficha técnica, Portales, Campaña Email, Redes Sociales, Cartelería, Video, Tour Virtual, Otro.</w:t>
+        <w:t>Describir el edificio y el entorno, adjuntar los materiales indicando su tipo (fotos, planos, brochure, video, tour virtual, render u otro) y elegir las acciones de marketing necesarias.</w:t>
       </w:r>
     </w:p>
     <w:p>
@@ -660,7 +726,40 @@
     </w:p>
     <w:p>
       <w:r>
-        <w:t>Cada ticket tiene un estado: Pendiente, En proceso o Finalizada. Se puede cambiar desde la ficha del ticket.</w:t>
+        <w:t>Cada ticket tiene un estado: Pendiente, En proceso o Finalizada. Si pasa la fecha de entrega sin finalizarse, se muestra como Vencida.</w:t>
+      </w:r>
+    </w:p>
+    <w:p>
+      <w:r>
+        <w:rPr>
+          <w:color w:val="C9D6F0"/>
+        </w:rPr>
+        <w:t>──────────────────────────────────────────────</w:t>
+      </w:r>
+    </w:p>
+    <w:p>
+      <w:r>
+        <w:rPr>
+          <w:b/>
+          <w:color w:val="00285A"/>
+          <w:sz w:val="23"/>
+        </w:rPr>
+        <w:t>Registrar actividad no es lo mismo</w:t>
+      </w:r>
+    </w:p>
+    <w:p>
+      <w:r>
+        <w:rPr>
+          <w:b/>
+          <w:color w:val="1C54F4"/>
+          <w:sz w:val="21"/>
+        </w:rPr>
+        <w:t>Qué ingresar:</w:t>
+      </w:r>
+    </w:p>
+    <w:p>
+      <w:r>
+        <w:t>El botón 'Registrar actividad' es solo para actividades comerciales (visitas, llamadas, reuniones, propuestas). Los trabajos de Marketing &amp; Research se piden únicamente desde este módulo.</w:t>
       </w:r>
     </w:p>
     <w:p/>
@@ -688,6 +787,14 @@
       </w:pPr>
       <w:r>
         <w:t>Se crea el Ticket (por ejemplo, Solicitud #000001) con estado Pendiente.</w:t>
+      </w:r>
+    </w:p>
+    <w:p>
+      <w:pPr>
+        <w:pStyle w:val="ListBullet"/>
+      </w:pPr>
+      <w:r>
+        <w:t>La solicitud guarda en un solo registro los datos del Formulario Base y los del formulario específico.</w:t>
       </w:r>
     </w:p>
     <w:p>

</xml_diff>

<commit_message>
Formulario Base M&R: Cuenta o Contacto obligatorio (OR) y paso de datos al formulario especifico
- Valida en el formulario base que haya al menos una Cuenta o un Contacto; ninguno de los dos es obligatorio por separado
- Mensaje 'Debes indicar una Cuenta o un Contacto' con el resaltado en rojo que ya usa Nexus
- La Cuenta y el Contacto del base viajan con la solicitud y alimentan las relaciones existentes (cuenta / propietario), sin campos ni colecciones paralelas
- La pantalla de revision muestra la Cuenta y el Contacto cargados en el base
- Guia de usuario actualizada a 2.1

Co-Authored-By: Claude Opus 5 <noreply@anthropic.com>
Claude-Session: https://claude.ai/code/session_01JkU9BrFwXYbLVUvW55gcE9
</commit_message>
<xml_diff>
--- a/docs/manuales/Guia_Solicitudes.docx
+++ b/docs/manuales/Guia_Solicitudes.docx
@@ -80,7 +80,7 @@
           <w:color w:val="56648F"/>
           <w:sz w:val="21"/>
         </w:rPr>
-        <w:t>Versión 2.0   ·   21/08/2026</w:t>
+        <w:t>Versión 2.1   ·   21/08/2026</w:t>
       </w:r>
     </w:p>
     <w:p/>
@@ -216,7 +216,7 @@
           <w:color w:val="00285A"/>
           <w:sz w:val="23"/>
         </w:rPr>
-        <w:t>Cuenta</w:t>
+        <w:t>Cuenta / Contacto</w:t>
       </w:r>
     </w:p>
     <w:p>
@@ -231,40 +231,7 @@
     </w:p>
     <w:p>
       <w:r>
-        <w:t>Qué ingresar: buscar la cuenta con el buscador inteligente. Es opcional, pero conviene indicarla para que el equipo tenga contexto.</w:t>
-      </w:r>
-    </w:p>
-    <w:p>
-      <w:r>
-        <w:rPr>
-          <w:color w:val="C9D6F0"/>
-        </w:rPr>
-        <w:t>──────────────────────────────────────────────</w:t>
-      </w:r>
-    </w:p>
-    <w:p>
-      <w:r>
-        <w:rPr>
-          <w:b/>
-          <w:color w:val="00285A"/>
-          <w:sz w:val="23"/>
-        </w:rPr>
-        <w:t>Contacto</w:t>
-      </w:r>
-    </w:p>
-    <w:p>
-      <w:r>
-        <w:rPr>
-          <w:b/>
-          <w:color w:val="1C54F4"/>
-          <w:sz w:val="21"/>
-        </w:rPr>
-        <w:t>Qué ingresar:</w:t>
-      </w:r>
-    </w:p>
-    <w:p>
-      <w:r>
-        <w:t>Qué ingresar: buscar la persona de contacto. Si se elige un contacto que ya tiene cuenta, la cuenta se completa sola.</w:t>
+        <w:t>Qué ingresar: al menos uno de los dos. Se puede indicar solo la Cuenta, solo el Contacto (útil para particulares que todavía no tienen cuenta) o ambos. Si se elige un contacto que ya tiene cuenta, la cuenta se completa sola. Si no se carga ninguno, el sistema avisa: 'Debés indicar una Cuenta o un Contacto' y no deja continuar. Estos datos se cargan una sola vez: el formulario específico no los vuelve a pedir.</w:t>
       </w:r>
     </w:p>
     <w:p>

</xml_diff>

<commit_message>
Fichas y Publicaciones: ubicacion de Google Maps automatica al elegir el inmueble
- Reutiliza el campo urlMaps ya existente en la solicitud (sin campos nuevos ni segunda direccion)
- Helper unico _mapsUrlFromBld: reutiliza la URL propia del inmueble si la tiene y, si no, la arma con _geocodeAddr (gMapsAddr -> direccion) en formato maps/search?api=1
- Muestra 'Ver ubicacion en Google Maps' como link en pestana nueva, en el formulario y en la ficha de la solicitud
- Se recalcula al cambiar de inmueble y se limpia al deseleccionarlo
- Sin direccion suficiente: aviso discreto, sin generar una URL incorrecta ni modificar la ficha del inmueble
- Guia de usuario actualizada a 2.2

Co-Authored-By: Claude Opus 5 <noreply@anthropic.com>
Claude-Session: https://claude.ai/code/session_01JkU9BrFwXYbLVUvW55gcE9
</commit_message>
<xml_diff>
--- a/docs/manuales/Guia_Solicitudes.docx
+++ b/docs/manuales/Guia_Solicitudes.docx
@@ -80,7 +80,7 @@
           <w:color w:val="56648F"/>
           <w:sz w:val="21"/>
         </w:rPr>
-        <w:t>Versión 2.1   ·   21/08/2026</w:t>
+        <w:t>Versión 2.2   ·   21/08/2026</w:t>
       </w:r>
     </w:p>
     <w:p/>
@@ -546,6 +546,39 @@
           <w:color w:val="00285A"/>
           <w:sz w:val="23"/>
         </w:rPr>
+        <w:t>Ubicación en Google Maps</w:t>
+      </w:r>
+    </w:p>
+    <w:p>
+      <w:r>
+        <w:rPr>
+          <w:b/>
+          <w:color w:val="1C54F4"/>
+          <w:sz w:val="21"/>
+        </w:rPr>
+        <w:t>Qué ingresar:</w:t>
+      </w:r>
+    </w:p>
+    <w:p>
+      <w:r>
+        <w:t>No hay que cargarla: al seleccionar el inmueble, Nexus arma sola la ubicación y muestra el enlace 'Ver ubicación en Google Maps', que abre el mapa en una pestaña nueva. Si se cambia el inmueble, la ubicación se actualiza. Si el inmueble no tiene una dirección completa, se avisa y no se genera un enlace incorrecto.</w:t>
+      </w:r>
+    </w:p>
+    <w:p>
+      <w:r>
+        <w:rPr>
+          <w:color w:val="C9D6F0"/>
+        </w:rPr>
+        <w:t>──────────────────────────────────────────────</w:t>
+      </w:r>
+    </w:p>
+    <w:p>
+      <w:r>
+        <w:rPr>
+          <w:b/>
+          <w:color w:val="00285A"/>
+          <w:sz w:val="23"/>
+        </w:rPr>
         <w:t>Tipo de transacción</w:t>
       </w:r>
     </w:p>

</xml_diff>

<commit_message>
Ficha y Publicacion vuelve a ser UNA sola actividad; la separacion es visual
- El dropdown de Tipo de actividad muestra 'Ficha y Publicacion' como unica entrada (se revierte el split en dos actividades)
- La separacion FICHA (pasos 1-3) / PUBLICACION (pasos 4-6) queda como marcador visual: agrupacion en el stepper y banner de etapa dentro del formulario, indicando hasta donde completar
- Sin cambios en el catalogo, el servicio ni los datos guardados

Co-Authored-By: Claude Opus 5 <noreply@anthropic.com>
Claude-Session: https://claude.ai/code/session_01JkU9BrFwXYbLVUvW55gcE9
</commit_message>
<xml_diff>
--- a/docs/manuales/Guia_Solicitudes.docx
+++ b/docs/manuales/Guia_Solicitudes.docx
@@ -80,7 +80,7 @@
           <w:color w:val="56648F"/>
           <w:sz w:val="21"/>
         </w:rPr>
-        <w:t>Versión 3.0   ·   21/08/2026</w:t>
+        <w:t>Versión 3.1   ·   21/08/2026</w:t>
       </w:r>
     </w:p>
     <w:p/>
@@ -165,7 +165,7 @@
     </w:p>
     <w:p>
       <w:r>
-        <w:t>Qué ingresar: elegir la actividad de Marketing &amp; Research que se necesita (por ejemplo, Ficha y Publicaciones – Oficinas). Arranca en 'Seleccionar' y define a qué formulario específico se continúa.</w:t>
+        <w:t>Qué ingresar: elegir la actividad de Marketing &amp; Research que se necesita. 'Ficha y Publicación' es una sola actividad: dentro del formulario está marcado hasta dónde completar según se necesite solo la Ficha o también la Publicación. Arranca en 'Seleccionar' y define a qué formulario específico se continúa.</w:t>
       </w:r>
     </w:p>
     <w:p>

</xml_diff>

<commit_message>
Ficha y Publicacion: 'Equipamiento' y 'Caracteristicas del equipo' pasan a 'Caracteristicas del edificio'
Solo nomenclatura visible: mismo campo (especificaciones), misma obligatoriedad, misma carga
automatica desde los amenities del edificio y misma edicion por parte del broker.

Co-Authored-By: Claude Opus 5 <noreply@anthropic.com>
Claude-Session: https://claude.ai/code/session_01JkU9BrFwXYbLVUvW55gcE9
</commit_message>
<xml_diff>
--- a/docs/manuales/Guia_Solicitudes.docx
+++ b/docs/manuales/Guia_Solicitudes.docx
@@ -80,7 +80,7 @@
           <w:color w:val="56648F"/>
           <w:sz w:val="21"/>
         </w:rPr>
-        <w:t>Versión 3.1   ·   21/08/2026</w:t>
+        <w:t>Versión 3.2   ·   21/08/2026</w:t>
       </w:r>
     </w:p>
     <w:p/>
@@ -678,7 +678,7 @@
           <w:color w:val="00285A"/>
           <w:sz w:val="23"/>
         </w:rPr>
-        <w:t>Características del equipo</w:t>
+        <w:t>Características del edificio</w:t>
       </w:r>
     </w:p>
     <w:p>

</xml_diff>

<commit_message>
Ficha y Publicacion: intercambia los pasos 3 y 4
Paso 3 pasa a ser Contenido (Ficha) y paso 4 Caracteristicas (Publicacion). Solo cambia la
posicion y numeracion: mismas tarjetas, mismos campos y misma logica en cada paso.

Co-Authored-By: Claude Opus 5 <noreply@anthropic.com>
Claude-Session: https://claude.ai/code/session_01JkU9BrFwXYbLVUvW55gcE9
</commit_message>
<xml_diff>
--- a/docs/manuales/Guia_Solicitudes.docx
+++ b/docs/manuales/Guia_Solicitudes.docx
@@ -80,7 +80,7 @@
           <w:color w:val="56648F"/>
           <w:sz w:val="21"/>
         </w:rPr>
-        <w:t>Versión 3.2   ·   21/08/2026</w:t>
+        <w:t>Versión 3.3   ·   21/08/2026</w:t>
       </w:r>
     </w:p>
     <w:p/>
@@ -462,7 +462,7 @@
     </w:p>
     <w:p>
       <w:r>
-        <w:t>Al continuar se abre el formulario de la actividad elegida, agrupado en dos etapas. FICHA: 1) Información General, 2) Información Comercial, 3) Características. PUBLICACIÓN: 4) Contenido, 5) Documentación y Difusión, 6) Comentarios. Al final hay una pantalla de Revisión. Se avanza con 'Siguiente' y se vuelve con 'Atrás' sin perder datos. Cada paso valida sus obligatorios. Los datos ya cargados en el Formulario Base no se vuelven a pedir.</w:t>
+        <w:t>Al continuar se abre el formulario de la actividad elegida, agrupado en dos etapas. FICHA: 1) Información General, 2) Información Comercial, 3) Contenido. PUBLICACIÓN: 4) Características, 5) Documentación y Difusión, 6) Comentarios. Al final hay una pantalla de Revisión. Se avanza con 'Siguiente' y se vuelve con 'Atrás' sin perder datos. Cada paso valida sus obligatorios. Los datos ya cargados en el Formulario Base no se vuelven a pedir.</w:t>
       </w:r>
     </w:p>
     <w:p>

</xml_diff>

<commit_message>
Ficha y Publicacion: precios por tipo de operacion y baja de la especificacion de pisos
- El detalle de Disponibilidad (piso / m2 / cocheras) reemplaza al texto 'Especificacion de pisos y m2', que deja de pedirse y se conserva solo para las solicitudes que ya lo tienen
- Los precios dependen de la operacion: Alquiler abre precio total y precio por m2 de alquiler, Venta los de venta y 'Alquiler y Venta' abre los dos juegos de campos
- Precio total opcional y precio por m2 obligatorio en cada operacion
- Los precios genericos anteriores quedan como campos historicos
- Guia de usuario actualizada a 4.1

Co-Authored-By: Claude Opus 5 <noreply@anthropic.com>
Claude-Session: https://claude.ai/code/session_01JkU9BrFwXYbLVUvW55gcE9
</commit_message>
<xml_diff>
--- a/docs/manuales/Guia_Solicitudes.docx
+++ b/docs/manuales/Guia_Solicitudes.docx
@@ -80,7 +80,7 @@
           <w:color w:val="56648F"/>
           <w:sz w:val="21"/>
         </w:rPr>
-        <w:t>Versión 4.0   ·   21/08/2026</w:t>
+        <w:t>Versión 4.1   ·   21/08/2026</w:t>
       </w:r>
     </w:p>
     <w:p/>
@@ -843,7 +843,7 @@
           <w:color w:val="00285A"/>
           <w:sz w:val="23"/>
         </w:rPr>
-        <w:t>Precio total y Precio por m²</w:t>
+        <w:t>Precios</w:t>
       </w:r>
     </w:p>
     <w:p>
@@ -858,7 +858,7 @@
     </w:p>
     <w:p>
       <w:r>
-        <w:t>El precio total es opcional. El precio por m² es obligatorio: sin ese dato no se puede avanzar.</w:t>
+        <w:t>Los precios que se piden dependen del tipo de operación. Con Alquiler aparecen el precio total de alquiler y el precio por m² de alquiler; con Venta, los de venta; y con 'Alquiler y Venta' se abren los dos juegos de campos. En todos los casos el precio total es opcional y el precio por m² es obligatorio.</w:t>
       </w:r>
     </w:p>
     <w:p>
@@ -891,7 +891,7 @@
     </w:p>
     <w:p>
       <w:r>
-        <w:t>Agregar una fila por piso que se quiera incluir en la Ficha, indicando Piso, m² y Cocheras. Se pueden agregar y quitar filas.</w:t>
+        <w:t>Agregar una fila por piso que se quiera incluir en la Ficha, indicando Piso, m² y Cocheras. Se pueden agregar y quitar filas. Este detalle reemplaza al texto de especificación de pisos: no hay que cargarlo dos veces.</w:t>
       </w:r>
     </w:p>
     <w:p>

</xml_diff>

<commit_message>
Ficha y Publicacion: elimina el paso Documentacion y Difusion y hace obligatorio Equipamiento y Servicios
- Publicacion queda con 2 pasos: 4 Caracteristicas y 5 Comentarios (el wizard pasa a 5 pasos + Revision)
- Documentacion y acciones de marketing dejan de pedirse; se conservan para las solicitudes que ya las tienen
- Equipamiento y Servicios exige responder Si/No en todos los servicios para poder avanzar
- Guia de usuario actualizada a 4.2

Co-Authored-By: Claude Opus 5 <noreply@anthropic.com>
Claude-Session: https://claude.ai/code/session_01JkU9BrFwXYbLVUvW55gcE9
</commit_message>
<xml_diff>
--- a/docs/manuales/Guia_Solicitudes.docx
+++ b/docs/manuales/Guia_Solicitudes.docx
@@ -80,7 +80,7 @@
           <w:color w:val="56648F"/>
           <w:sz w:val="21"/>
         </w:rPr>
-        <w:t>Versión 4.1   ·   21/08/2026</w:t>
+        <w:t>Versión 4.2   ·   21/08/2026</w:t>
       </w:r>
     </w:p>
     <w:p/>
@@ -462,7 +462,7 @@
     </w:p>
     <w:p>
       <w:r>
-        <w:t>Al continuar se abre el formulario de la actividad elegida, agrupado en dos etapas. FICHA: 1) Información General, 2) Información Comercial, 3) Contenido. PUBLICACIÓN: 4) Características, 5) Documentación y Difusión, 6) Comentarios. Al final hay una pantalla de Revisión. Se avanza con 'Siguiente' y se vuelve con 'Atrás' sin perder datos. Los datos ya cargados en el Formulario Base no se vuelven a pedir.</w:t>
+        <w:t>Al continuar se abre el formulario de la actividad elegida, agrupado en dos etapas. FICHA: 1) Información General, 2) Información Comercial, 3) Contenido. PUBLICACIÓN: 4) Características, 5) Comentarios. Al final hay una pantalla de Revisión. Se avanza con 'Siguiente' y se vuelve con 'Atrás' sin perder datos. Los datos ya cargados en el Formulario Base no se vuelven a pedir.</w:t>
       </w:r>
     </w:p>
     <w:p>
@@ -495,7 +495,7 @@
     </w:p>
     <w:p>
       <w:r>
-        <w:t>Con los pasos 1 a 3 completos ya alcanza para pedir la Ficha: el botón 'Generar solicitud de ficha' lleva directo a la Revisión. Si además se necesita la Publicación, continuar con los pasos 4, 5 y 6.</w:t>
+        <w:t>Con los pasos 1 a 3 completos ya alcanza para pedir la Ficha: el botón 'Generar solicitud de ficha' lleva directo a la Revisión. Si además se necesita la Publicación, continuar con los pasos 4 y 5.</w:t>
       </w:r>
     </w:p>
     <w:p>
@@ -1107,6 +1107,39 @@
           <w:color w:val="00285A"/>
           <w:sz w:val="23"/>
         </w:rPr>
+        <w:t>Equipamiento y Servicios</w:t>
+      </w:r>
+    </w:p>
+    <w:p>
+      <w:r>
+        <w:rPr>
+          <w:b/>
+          <w:color w:val="1C54F4"/>
+          <w:sz w:val="21"/>
+        </w:rPr>
+        <w:t>Qué ingresar:</w:t>
+      </w:r>
+    </w:p>
+    <w:p>
+      <w:r>
+        <w:t>Es obligatorio: hay que responder Sí o No en cada uno de los servicios de la lista para poder avanzar.</w:t>
+      </w:r>
+    </w:p>
+    <w:p>
+      <w:r>
+        <w:rPr>
+          <w:color w:val="C9D6F0"/>
+        </w:rPr>
+        <w:t>──────────────────────────────────────────────</w:t>
+      </w:r>
+    </w:p>
+    <w:p>
+      <w:r>
+        <w:rPr>
+          <w:b/>
+          <w:color w:val="00285A"/>
+          <w:sz w:val="23"/>
+        </w:rPr>
         <w:t>Estado</w:t>
       </w:r>
     </w:p>

</xml_diff>

<commit_message>
Solicitud de Ficha y Publicacion: logo en el PDF, comentarios en el paso 5 y marca visual en Equipamiento
- El PDF de la solicitud lleva el logo de Colliers en el margen superior derecho (misma imagen que usa la app)
- El paso 5 vuelve a mostrar su caja de Comentarios: los del formulario base se guardan aparte (comentariosBase), asi que ya no la ocultan
- En Equipamiento y Servicios cada servicio respondido se pinta de verde con una tilde; la obligatoriedad de responder todos se mantiene
- Guia de usuario actualizada a 4.3

Co-Authored-By: Claude Opus 5 <noreply@anthropic.com>
Claude-Session: https://claude.ai/code/session_01JkU9BrFwXYbLVUvW55gcE9
</commit_message>
<xml_diff>
--- a/docs/manuales/Guia_Solicitudes.docx
+++ b/docs/manuales/Guia_Solicitudes.docx
@@ -80,7 +80,7 @@
           <w:color w:val="56648F"/>
           <w:sz w:val="21"/>
         </w:rPr>
-        <w:t>Versión 4.2   ·   21/08/2026</w:t>
+        <w:t>Versión 4.3   ·   21/08/2026</w:t>
       </w:r>
     </w:p>
     <w:p/>
@@ -792,7 +792,7 @@
     </w:p>
     <w:p>
       <w:r>
-        <w:t>Qué ingresar: opcional. Cualquier aclaración adicional para Marketing &amp; Research.</w:t>
+        <w:t>Qué ingresar: opcional. Cualquier aclaración adicional para Marketing &amp; Research. En el paso 5 hay además una caja de comentarios finales, también opcional.</w:t>
       </w:r>
     </w:p>
     <w:p>
@@ -1122,7 +1122,7 @@
     </w:p>
     <w:p>
       <w:r>
-        <w:t>Es obligatorio: hay que responder Sí o No en cada uno de los servicios de la lista para poder avanzar.</w:t>
+        <w:t>Es obligatorio: hay que responder Sí o No en cada uno de los servicios de la lista para poder avanzar. Cada servicio ya respondido se marca en verde con una tilde, así se ve de un vistazo qué falta.</w:t>
       </w:r>
     </w:p>
     <w:p>

</xml_diff>